<commit_message>
Updated documents in support I-20 implementation tasks.
</commit_message>
<xml_diff>
--- a/implementation/detailed-implementation-instructions/I-19_Direct_Implementation_Step 5.docx
+++ b/implementation/detailed-implementation-instructions/I-19_Direct_Implementation_Step 5.docx
@@ -994,9 +994,9 @@
       </w:r>
       <w:r>
         <w:rPr>
-          <w:color w:val="7030A0"/>
-        </w:rPr>
-        <w:t>IN PROCESS</w:t>
+          <w:color w:val="00B050"/>
+        </w:rPr>
+        <w:t>COMPLETE</w:t>
       </w:r>
     </w:p>
     <w:p>
@@ -1140,9 +1140,9 @@
       </w:r>
       <w:r>
         <w:rPr>
-          <w:color w:val="EE0000"/>
-        </w:rPr>
-        <w:t>NOT STARTED</w:t>
+          <w:color w:val="00B050"/>
+        </w:rPr>
+        <w:t>COMPLETE</w:t>
       </w:r>
     </w:p>
     <w:p>
@@ -1244,9 +1244,9 @@
       </w:r>
       <w:r>
         <w:rPr>
-          <w:color w:val="EE0000"/>
-        </w:rPr>
-        <w:t>NOT STARTED</w:t>
+          <w:color w:val="00B050"/>
+        </w:rPr>
+        <w:t>COMPLETE</w:t>
       </w:r>
     </w:p>
     <w:p>
@@ -1362,9 +1362,9 @@
       </w:r>
       <w:r>
         <w:rPr>
-          <w:color w:val="EE0000"/>
-        </w:rPr>
-        <w:t>NOT STARTED</w:t>
+          <w:color w:val="00B050"/>
+        </w:rPr>
+        <w:t>COMPLETE</w:t>
       </w:r>
     </w:p>
     <w:p>
@@ -1598,9 +1598,9 @@
       </w:r>
       <w:r>
         <w:rPr>
-          <w:color w:val="EE0000"/>
-        </w:rPr>
-        <w:t>NOT STARTED</w:t>
+          <w:color w:val="00B050"/>
+        </w:rPr>
+        <w:t>COMPLETE</w:t>
       </w:r>
     </w:p>
     <w:p>
@@ -1730,9 +1730,9 @@
       </w:r>
       <w:r>
         <w:rPr>
-          <w:color w:val="EE0000"/>
-        </w:rPr>
-        <w:t>NOT STARTED</w:t>
+          <w:color w:val="00B050"/>
+        </w:rPr>
+        <w:t>COMPLETE</w:t>
       </w:r>
     </w:p>
     <w:p>
@@ -1889,9 +1889,9 @@
       </w:r>
       <w:r>
         <w:rPr>
-          <w:color w:val="EE0000"/>
-        </w:rPr>
-        <w:t>NOT STARTED</w:t>
+          <w:color w:val="00B050"/>
+        </w:rPr>
+        <w:t>COMPLETE</w:t>
       </w:r>
     </w:p>
     <w:p>
@@ -2024,9 +2024,9 @@
       </w:r>
       <w:r>
         <w:rPr>
-          <w:color w:val="EE0000"/>
-        </w:rPr>
-        <w:t>NOT STARTED</w:t>
+          <w:color w:val="00B050"/>
+        </w:rPr>
+        <w:t>COMPLETE</w:t>
       </w:r>
     </w:p>
     <w:p>
@@ -2098,14 +2098,88 @@
       </w:r>
       <w:r>
         <w:rPr>
-          <w:color w:val="EE0000"/>
-        </w:rPr>
-        <w:t>NOT STARTED</w:t>
+          <w:color w:val="00B050"/>
+        </w:rPr>
+        <w:t>COMPLETE</w:t>
       </w:r>
     </w:p>
     <w:p>
       <w:r>
-        <w:t>In the Azure Static Web App resource, locate and copy the deployment token. Keep it private and do not place it in the React source code or Vite environment files.</w:t>
+        <w:t xml:space="preserve">In the </w:t>
+      </w:r>
+      <w:r>
+        <w:rPr>
+          <w:b/>
+          <w:bCs/>
+        </w:rPr>
+        <w:t>Azure Static Web App</w:t>
+      </w:r>
+      <w:r>
+        <w:t xml:space="preserve"> resource, </w:t>
+      </w:r>
+      <w:r>
+        <w:rPr>
+          <w:u w:val="thick"/>
+        </w:rPr>
+        <w:t>locate</w:t>
+      </w:r>
+      <w:r>
+        <w:t xml:space="preserve"> and </w:t>
+      </w:r>
+      <w:r>
+        <w:rPr>
+          <w:u w:val="thick"/>
+        </w:rPr>
+        <w:t>copy</w:t>
+      </w:r>
+      <w:r>
+        <w:t xml:space="preserve"> the </w:t>
+      </w:r>
+      <w:r>
+        <w:rPr>
+          <w:b/>
+          <w:bCs/>
+        </w:rPr>
+        <w:t>deployment token</w:t>
+      </w:r>
+      <w:r>
+        <w:t xml:space="preserve">. </w:t>
+      </w:r>
+      <w:r>
+        <w:rPr>
+          <w:u w:val="thick"/>
+        </w:rPr>
+        <w:t xml:space="preserve">Keep it </w:t>
+      </w:r>
+      <w:r>
+        <w:rPr>
+          <w:b/>
+          <w:bCs/>
+        </w:rPr>
+        <w:t>private</w:t>
+      </w:r>
+      <w:r>
+        <w:t xml:space="preserve"> and do not place it in the </w:t>
+      </w:r>
+      <w:r>
+        <w:rPr>
+          <w:b/>
+          <w:bCs/>
+        </w:rPr>
+        <w:t>React source code</w:t>
+      </w:r>
+      <w:r>
+        <w:t xml:space="preserve"> or </w:t>
+      </w:r>
+      <w:r>
+        <w:rPr>
+          <w:b/>
+          <w:bCs/>
+        </w:rPr>
+        <w:t>Vite environment files</w:t>
+      </w:r>
+      <w:r>
+        <w:t>.</w:t>
       </w:r>
     </w:p>
     <w:p>
@@ -2121,14 +2195,60 @@
       </w:r>
       <w:r>
         <w:rPr>
-          <w:color w:val="EE0000"/>
-        </w:rPr>
-        <w:t>NOT STARTED</w:t>
+          <w:color w:val="00B050"/>
+        </w:rPr>
+        <w:t>COMPLETE</w:t>
       </w:r>
     </w:p>
     <w:p>
       <w:r>
-        <w:t>After running npm run build, deploy the production files:</w:t>
+        <w:rPr>
+          <w:u w:val="thick"/>
+        </w:rPr>
+        <w:t>After</w:t>
+      </w:r>
+      <w:r>
+        <w:t xml:space="preserve"> </w:t>
+      </w:r>
+      <w:r>
+        <w:rPr>
+          <w:b/>
+          <w:bCs/>
+        </w:rPr>
+        <w:t>running npm</w:t>
+      </w:r>
+      <w:r>
+        <w:t xml:space="preserve"> run </w:t>
+      </w:r>
+      <w:r>
+        <w:rPr>
+          <w:b/>
+          <w:bCs/>
+        </w:rPr>
+        <w:t>build</w:t>
+      </w:r>
+      <w:r>
+        <w:t xml:space="preserve">, </w:t>
+      </w:r>
+      <w:r>
+        <w:rPr>
+          <w:b/>
+          <w:bCs/>
+        </w:rPr>
+        <w:t>deploy</w:t>
+      </w:r>
+      <w:r>
+        <w:t xml:space="preserve"> the </w:t>
+      </w:r>
+      <w:r>
+        <w:rPr>
+          <w:b/>
+          <w:bCs/>
+        </w:rPr>
+        <w:t>production</w:t>
+      </w:r>
+      <w:r>
+        <w:t xml:space="preserve"> files:</w:t>
       </w:r>
     </w:p>
     <w:p>
@@ -2138,7 +2258,53 @@
     </w:p>
     <w:p>
       <w:r>
-        <w:t>Wait for the deployment to complete successfully.</w:t>
+        <w:rPr>
+          <w:b/>
+          <w:bCs/>
+        </w:rPr>
+        <w:t>Wait</w:t>
+      </w:r>
+      <w:r>
+        <w:t xml:space="preserve"> </w:t>
+      </w:r>
+      <w:r>
+        <w:rPr>
+          <w:u w:val="thick"/>
+        </w:rPr>
+        <w:t>for</w:t>
+      </w:r>
+      <w:r>
+        <w:t xml:space="preserve"> the </w:t>
+      </w:r>
+      <w:r>
+        <w:rPr>
+          <w:b/>
+          <w:bCs/>
+        </w:rPr>
+        <w:t>deployment</w:t>
+      </w:r>
+      <w:r>
+        <w:t xml:space="preserve"> to </w:t>
+      </w:r>
+      <w:r>
+        <w:rPr>
+          <w:b/>
+          <w:bCs/>
+        </w:rPr>
+        <w:t>complete</w:t>
+      </w:r>
+      <w:r>
+        <w:t xml:space="preserve"> </w:t>
+      </w:r>
+      <w:r>
+        <w:rPr>
+          <w:b/>
+          <w:bCs/>
+        </w:rPr>
+        <w:t>successfully</w:t>
+      </w:r>
+      <w:r>
+        <w:t>.</w:t>
       </w:r>
     </w:p>
     <w:p>
@@ -2153,14 +2319,21 @@
       </w:r>
       <w:r>
         <w:rPr>
-          <w:color w:val="EE0000"/>
-        </w:rPr>
-        <w:t>NOT STARTED</w:t>
+          <w:color w:val="00B050"/>
+        </w:rPr>
+        <w:t>COMPLETE</w:t>
       </w:r>
     </w:p>
     <w:p>
       <w:r>
-        <w:t>Browse to:</w:t>
+        <w:rPr>
+          <w:b/>
+          <w:bCs/>
+        </w:rPr>
+        <w:t>Browse</w:t>
+      </w:r>
+      <w:r>
+        <w:t xml:space="preserve"> to:</w:t>
       </w:r>
     </w:p>
     <w:p>
@@ -2170,7 +2343,42 @@
     </w:p>
     <w:p>
       <w:r>
-        <w:t>Confirm the React UI loads over HTTPS.</w:t>
+        <w:rPr>
+          <w:u w:val="thick"/>
+        </w:rPr>
+        <w:t>Confirm</w:t>
+      </w:r>
+      <w:r>
+        <w:t xml:space="preserve"> the </w:t>
+      </w:r>
+      <w:r>
+        <w:rPr>
+          <w:b/>
+          <w:bCs/>
+        </w:rPr>
+        <w:t>React UI loads</w:t>
+      </w:r>
+      <w:r>
+        <w:t xml:space="preserve"> </w:t>
+      </w:r>
+      <w:r>
+        <w:rPr>
+          <w:u w:val="thick"/>
+        </w:rPr>
+        <w:t>over</w:t>
+      </w:r>
+      <w:r>
+        <w:t xml:space="preserve"> </w:t>
+      </w:r>
+      <w:r>
+        <w:rPr>
+          <w:b/>
+          <w:bCs/>
+        </w:rPr>
+        <w:t>HTTPS</w:t>
+      </w:r>
+      <w:r>
+        <w:t>.</w:t>
       </w:r>
     </w:p>
     <w:p>
@@ -2181,18 +2389,27 @@
         <w:t>Step 18 - Test Microsoft Entra authentication</w:t>
       </w:r>
       <w:r>
-        <w:t xml:space="preserve"> – </w:t>
-      </w:r>
-      <w:r>
-        <w:rPr>
-          <w:color w:val="EE0000"/>
-        </w:rPr>
-        <w:t>NOT STARTED</w:t>
+        <w:t xml:space="preserve"> –</w:t>
+      </w:r>
+      <w:r>
+        <w:t xml:space="preserve"> </w:t>
+      </w:r>
+      <w:r>
+        <w:rPr>
+          <w:color w:val="00B050"/>
+        </w:rPr>
+        <w:t>Test Microsoft Entra authentication — COMPLETE</w:t>
       </w:r>
     </w:p>
     <w:p>
       <w:r>
-        <w:t>Confirm all of the following:</w:t>
+        <w:rPr>
+          <w:u w:val="thick"/>
+        </w:rPr>
+        <w:t>Confirm</w:t>
+      </w:r>
+      <w:r>
+        <w:t xml:space="preserve"> all of the following:</w:t>
       </w:r>
     </w:p>
     <w:p>
@@ -2247,9 +2464,9 @@
       </w:r>
       <w:r>
         <w:rPr>
-          <w:color w:val="EE0000"/>
-        </w:rPr>
-        <w:t>NOT STARTED</w:t>
+          <w:color w:val="00B050"/>
+        </w:rPr>
+        <w:t>COMPLETE</w:t>
       </w:r>
     </w:p>
     <w:p>
@@ -2333,9 +2550,9 @@
       </w:r>
       <w:r>
         <w:rPr>
-          <w:color w:val="EE0000"/>
-        </w:rPr>
-        <w:t>NOT STARTED</w:t>
+          <w:color w:val="00B050"/>
+        </w:rPr>
+        <w:t>COMPLETE</w:t>
       </w:r>
     </w:p>
     <w:p>
@@ -2406,9 +2623,9 @@
       </w:r>
       <w:r>
         <w:rPr>
-          <w:color w:val="EE0000"/>
-        </w:rPr>
-        <w:t>NOT STARTED</w:t>
+          <w:color w:val="00B050"/>
+        </w:rPr>
+        <w:t>COMPLETE</w:t>
       </w:r>
     </w:p>
     <w:p>
@@ -2473,18 +2690,64 @@
       </w:r>
       <w:r>
         <w:rPr>
-          <w:color w:val="EE0000"/>
-        </w:rPr>
-        <w:t>NOT STARTED</w:t>
+          <w:color w:val="00B050"/>
+        </w:rPr>
+        <w:t>COMPLETE</w:t>
       </w:r>
     </w:p>
     <w:p>
       <w:r>
-        <w:t>Record these values in your implementation notes:</w:t>
+        <w:rPr>
+          <w:b/>
+          <w:bCs/>
+        </w:rPr>
+        <w:t xml:space="preserve">Record </w:t>
+      </w:r>
+      <w:r>
+        <w:rPr>
+          <w:u w:val="thick"/>
+        </w:rPr>
+        <w:t>these</w:t>
+      </w:r>
+      <w:r>
+        <w:rPr>
+          <w:b/>
+          <w:bCs/>
+        </w:rPr>
+        <w:t xml:space="preserve"> values</w:t>
+      </w:r>
+      <w:r>
+        <w:t xml:space="preserve"> in </w:t>
+      </w:r>
+      <w:r>
+        <w:rPr>
+          <w:u w:val="thick"/>
+        </w:rPr>
+        <w:t>your</w:t>
+      </w:r>
+      <w:r>
+        <w:rPr>
+          <w:b/>
+          <w:bCs/>
+        </w:rPr>
+        <w:t xml:space="preserve"> implementation notes</w:t>
+      </w:r>
+      <w:r>
+        <w:t>:</w:t>
       </w:r>
     </w:p>
     <w:p>
-      <w:r>
+      <w:pPr>
+        <w:rPr>
+          <w:b/>
+          <w:bCs/>
+        </w:rPr>
+      </w:pPr>
+      <w:r>
+        <w:rPr>
+          <w:b/>
+          <w:bCs/>
+        </w:rPr>
         <w:t>React UI:</w:t>
       </w:r>
     </w:p>
@@ -2494,7 +2757,17 @@
       </w:r>
     </w:p>
     <w:p>
-      <w:r>
+      <w:pPr>
+        <w:rPr>
+          <w:b/>
+          <w:bCs/>
+        </w:rPr>
+      </w:pPr>
+      <w:r>
+        <w:rPr>
+          <w:b/>
+          <w:bCs/>
+        </w:rPr>
         <w:t>Function API:</w:t>
       </w:r>
     </w:p>
@@ -2504,7 +2777,17 @@
       </w:r>
     </w:p>
     <w:p>
-      <w:r>
+      <w:pPr>
+        <w:rPr>
+          <w:b/>
+          <w:bCs/>
+        </w:rPr>
+      </w:pPr>
+      <w:r>
+        <w:rPr>
+          <w:b/>
+          <w:bCs/>
+        </w:rPr>
         <w:t>Entra redirect:</w:t>
       </w:r>
     </w:p>
@@ -2525,9 +2808,9 @@
       </w:r>
       <w:r>
         <w:rPr>
-          <w:color w:val="EE0000"/>
-        </w:rPr>
-        <w:t>NOT STARTED</w:t>
+          <w:color w:val="00B050"/>
+        </w:rPr>
+        <w:t>COMPLETE</w:t>
       </w:r>
     </w:p>
     <w:p>
@@ -3634,7 +3917,6 @@
   <w:style w:type="character" w:default="1" w:styleId="DefaultParagraphFont">
     <w:name w:val="Default Paragraph Font"/>
     <w:uiPriority w:val="1"/>
-    <w:semiHidden/>
     <w:unhideWhenUsed/>
   </w:style>
   <w:style w:type="table" w:default="1" w:styleId="TableNormal">

</xml_diff>